<commit_message>
Make seeded defects deterministic and update demo data
</commit_message>
<xml_diff>
--- a/docs/02_SRS_RailGo.docx
+++ b/docs/02_SRS_RailGo.docx
@@ -1977,7 +1977,7 @@
                 <w:b w:val="0"/>
                 <w:sz w:val="16"/>
               </w:rPr>
-              <w:t>Xem chi tiết chuyến</w:t>
+              <w:t>Xem và sắp xếp chuyến</w:t>
             </w:r>
           </w:p>
         </w:tc>
@@ -1998,7 +1998,7 @@
                 <w:b w:val="0"/>
                 <w:sz w:val="16"/>
               </w:rPr>
-              <w:t>Hiển thị tàu, thời gian, giá cơ bản và số chỗ còn lại.</w:t>
+              <w:t>Hiển thị tàu, thời gian, giá, số chỗ; cho phép sắp xếp đúng theo giờ đi, giá thấp nhất hoặc số chỗ còn lại.</w:t>
             </w:r>
           </w:p>
         </w:tc>

</xml_diff>